<commit_message>
Just a bit of stuff about memory.
</commit_message>
<xml_diff>
--- a/Chapter 15 - Listing Badly.docx
+++ b/Chapter 15 - Listing Badly.docx
@@ -4,7 +4,10 @@
   <w:body>
     <w:p>
       <w:r>
-        <w:t>It was a habit he’d picked up when he was a new recruit. He’d got in trouble for.</w:t>
+        <w:t>It was a habit he’d picked up when he was a new recruit. He’d got in trouble for</w:t>
+      </w:r>
+      <w:r>
+        <w:t xml:space="preserve"> it.</w:t>
       </w:r>
     </w:p>
     <w:p>
@@ -18,32 +21,112 @@
     </w:p>
     <w:p>
       <w:r>
-        <w:t>So, he would turn it into a kind of song, in his head. He’d make a list.</w:t>
-      </w:r>
-    </w:p>
-    <w:p>
-      <w:r>
-        <w:t xml:space="preserve">So like now, sitting in the café, he’d known the minute he walked in would be his local. And then he’d started to read about how to </w:t>
+        <w:t>So he would turn it into a kind of song, in his head. He’d make a list.</w:t>
+      </w:r>
+    </w:p>
+    <w:p>
+      <w:r>
+        <w:t>L</w:t>
+      </w:r>
+      <w:r>
+        <w:t xml:space="preserve">ike now, sitting in the café, he’d known the minute he walked in would be his local. </w:t>
       </w:r>
     </w:p>
     <w:p>
       <w:r>
         <w:t>Man and woman in hi-vis.</w:t>
       </w:r>
-    </w:p>
-    <w:p>
-      <w:r>
-        <w:t xml:space="preserve">Hay fever tablets. </w:t>
-      </w:r>
-    </w:p>
-    <w:p>
-      <w:r>
-        <w:t>And air freshener! Klee tried to stop his mind from boggling. If your nose was blocked from hay fever, why did you need the air freshener? Or was the story that you needed the hay fever tablets because otherwise you couldn’t breathe, but when you could breathe – whatever environment it was that was that you were in, you were going to need air freshener.</w:t>
-      </w:r>
-    </w:p>
-    <w:p>
-      <w:r>
-        <w:t xml:space="preserve">Then he’d read the books on how to have a perfect memory or how to remember anything. </w:t>
+      <w:r>
+        <w:t xml:space="preserve"> Orange hi-vis? Who works in orange </w:t>
+      </w:r>
+      <w:proofErr w:type="spellStart"/>
+      <w:r>
+        <w:t>hi-viz</w:t>
+      </w:r>
+      <w:proofErr w:type="spellEnd"/>
+      <w:r>
+        <w:t>?</w:t>
+      </w:r>
+    </w:p>
+    <w:p>
+      <w:r>
+        <w:t>The woman offering the man h</w:t>
+      </w:r>
+      <w:r>
+        <w:t xml:space="preserve">ay fever tablets. </w:t>
+      </w:r>
+    </w:p>
+    <w:p>
+      <w:r>
+        <w:t>And then showing him two packs of air</w:t>
+      </w:r>
+      <w:r>
+        <w:t xml:space="preserve"> freshener! Klee tried to stop his mind from boggling. If your nose was blocked from hay fever, why did you need the air freshener? Or was the story that you needed the hay fever tablets because otherwise you couldn’t breathe, but when you could breathe – whatever environment it was that was that you were in, you were going to need air freshener.</w:t>
+      </w:r>
+    </w:p>
+    <w:p>
+      <w:r>
+        <w:t>A woman, thirties, short hair, no wedding ring. Two dogs. A poodle, or something like that, one of these adorable crosses. And a dog, the shape of a corgi, but with grey blue spots on a what background. And pale, grey-blue eyes.</w:t>
+      </w:r>
+    </w:p>
+    <w:p>
+      <w:r>
+        <w:t xml:space="preserve">A large man, who somehow managed to look clumsy, even when all he was doing was walking in the shop. He paid with a card which he got out of his wallet, several other cards dropped to the floor, he bent to pick them up. Doing that he caught a basked of crisps that was in front of the checkout. The small Indian woman behind the counter – whose name was </w:t>
+      </w:r>
+      <w:proofErr w:type="spellStart"/>
+      <w:r>
+        <w:t>Anunciata</w:t>
+      </w:r>
+      <w:proofErr w:type="spellEnd"/>
+      <w:r>
+        <w:t>, came out from behind the counter to help him pick up the crips. The small Indian man fixed him with a glance. Making sure that he paid. This guys name was Sunny. It had crossed both Sunny, and Klee’s mind that this clumsiness was just and act to create a distraction so that the clumsy man could steal chocolate, or crisps.</w:t>
+      </w:r>
+    </w:p>
+    <w:p>
+      <w:r>
+        <w:t>But now, watching the clumsy man try to put sugar in his coffee, he changed his mind. No, this was real clumsiness. Maybe some neurological condition. The man – a big man, with woolly dark hair, and enormous shoes – he thought of Jackie for a moment. Walked back towards the door with his coffee. Somehow he had put the lid on it correctly and it was spilling and dripping down his hand.</w:t>
+      </w:r>
+    </w:p>
+    <w:p>
+      <w:r>
+        <w:t>Listing what he could see. And then, remembering what he could see.</w:t>
+      </w:r>
+    </w:p>
+    <w:p>
+      <w:r>
+        <w:t xml:space="preserve">He’d seen a book in a house. Someone had been burgled. Their shelves had rivalled </w:t>
+      </w:r>
+      <w:proofErr w:type="spellStart"/>
+      <w:r>
+        <w:t>Mr</w:t>
+      </w:r>
+      <w:proofErr w:type="spellEnd"/>
+      <w:r>
+        <w:t xml:space="preserve"> Boht’s. This guy was a magician. And one entire bookshelf was books on memory. </w:t>
+      </w:r>
+    </w:p>
+    <w:p>
+      <w:r>
+        <w:lastRenderedPageBreak/>
+        <w:t xml:space="preserve">When they’d asked the man – a young man. Looking at the bookshelves and the carpets, and the curios. Yes, that’s what they were, curios. Blonde hair, twentysomething. Already going bald. </w:t>
+      </w:r>
+    </w:p>
+    <w:p>
+      <w:r>
+        <w:t>When, off the top of his head he listed exactly the things that had been stolen, the other policemen were immediately suspicious? Was this an insurance job? No, it wasn’t, no insurance.</w:t>
+      </w:r>
+    </w:p>
+    <w:p>
+      <w:r>
+        <w:t>But what he did have was a good memory.</w:t>
+      </w:r>
+      <w:r>
+        <w:t xml:space="preserve"> A Chinese puzzle box, a set of steel rings, a book of1000 card tricks that can be done without preparation. A guillotine (1:76 scale).</w:t>
+      </w:r>
+    </w:p>
+    <w:p>
+      <w:r>
+        <w:t xml:space="preserve">Klee had started with one book “Remember Everything!” But before long, he had his own bookshelf full of books on memory tricks. </w:t>
       </w:r>
     </w:p>
     <w:p>
@@ -110,25 +193,25 @@
     </w:p>
     <w:p>
       <w:r>
+        <w:t>WTYHAG – as it was never known – was a Saturday night prime time TV show. The premise was that there would be a demonstration from an expert. A chef would demonstrate how to bone a chicken. Someone would do something with origami.</w:t>
+      </w:r>
+    </w:p>
+    <w:p>
+      <w:r>
+        <w:t xml:space="preserve">A serial killer would </w:t>
+      </w:r>
+      <w:r>
+        <w:t>expertly dismember a body.</w:t>
+      </w:r>
+    </w:p>
+    <w:p>
+      <w:r>
+        <w:t xml:space="preserve">OK that never happened. </w:t>
+      </w:r>
+    </w:p>
+    <w:p>
+      <w:r>
         <w:lastRenderedPageBreak/>
-        <w:t>WTYHAG – as it was never known – was a Saturday night prime time TV show. The premise was that there would be a demonstration from an expert. A chef would demonstrate how to bone a chicken. Someone would do something with origami.</w:t>
-      </w:r>
-    </w:p>
-    <w:p>
-      <w:r>
-        <w:t xml:space="preserve">A serial killer would </w:t>
-      </w:r>
-      <w:r>
-        <w:t>expertly dismember a body.</w:t>
-      </w:r>
-    </w:p>
-    <w:p>
-      <w:r>
-        <w:t xml:space="preserve">OK that never happened. </w:t>
-      </w:r>
-    </w:p>
-    <w:p>
-      <w:r>
         <w:t>So, the gag of the show was that the contestants would be terrible at the cake decorating or hair cutting or beef jointing – come to think of it, there was actually quite a lot of dismemberment. But whoever was best at it, at the end of the show, they would get the chance – just the chance – to win a prize – actually prizes.</w:t>
       </w:r>
     </w:p>
@@ -142,7 +225,23 @@
         <w:t>A teas made! A cuddly toy! A fondue set. What the holy living fuck was a fondue set</w:t>
       </w:r>
       <w:r>
-        <w:t>? This was the seventies. A machine that woke you up to the blurpy blurpy sound of a tiny amount of tea being made with explosive inefficiency right next to your ear – that was the height of sophistication. Actually</w:t>
+        <w:t xml:space="preserve">? This was the seventies. A machine that woke you up to the </w:t>
+      </w:r>
+      <w:proofErr w:type="spellStart"/>
+      <w:r>
+        <w:t>blurpy</w:t>
+      </w:r>
+      <w:proofErr w:type="spellEnd"/>
+      <w:r>
+        <w:t xml:space="preserve"> </w:t>
+      </w:r>
+      <w:proofErr w:type="spellStart"/>
+      <w:r>
+        <w:t>blurpy</w:t>
+      </w:r>
+      <w:proofErr w:type="spellEnd"/>
+      <w:r>
+        <w:t xml:space="preserve"> sound of a tiny amount of tea being made with explosive inefficiency right next to your ear – that was the height of sophistication. Actually</w:t>
       </w:r>
       <w:r>
         <w:t>,</w:t>

</xml_diff>

<commit_message>
Fix English issues in Chapter 15 - Listing Badly
</commit_message>
<xml_diff>
--- a/Chapter 15 - Listing Badly.docx
+++ b/Chapter 15 - Listing Badly.docx
@@ -12,7 +12,7 @@
     </w:p>
     <w:p>
       <w:r>
-        <w:t>“You’re not supposed to write everything down Klee. Just the pertinent points.”</w:t>
+        <w:t>“You’re not supposed to write everything down, Klee. Just the pertinent points.”</w:t>
       </w:r>
       <w:r>
         <w:br/>
@@ -29,7 +29,7 @@
         <w:t>L</w:t>
       </w:r>
       <w:r>
-        <w:t xml:space="preserve">ike now, sitting in the café, he’d known the minute he walked in would be his local. </w:t>
+        <w:t xml:space="preserve">ike now, sitting in the café, he’d known the minute he walked in it would be his local. </w:t>
       </w:r>
     </w:p>
     <w:p>
@@ -41,7 +41,7 @@
       </w:r>
       <w:proofErr w:type="spellStart"/>
       <w:r>
-        <w:t>hi-viz</w:t>
+        <w:t>hi-vis</w:t>
       </w:r>
       <w:proofErr w:type="spellEnd"/>
       <w:r>
@@ -61,17 +61,17 @@
         <w:t>And then showing him two packs of air</w:t>
       </w:r>
       <w:r>
-        <w:t xml:space="preserve"> freshener! Klee tried to stop his mind from boggling. If your nose was blocked from hay fever, why did you need the air freshener? Or was the story that you needed the hay fever tablets because otherwise you couldn’t breathe, but when you could breathe – whatever environment it was that was that you were in, you were going to need air freshener.</w:t>
-      </w:r>
-    </w:p>
-    <w:p>
-      <w:r>
-        <w:t>A woman, thirties, short hair, no wedding ring. Two dogs. A poodle, or something like that, one of these adorable crosses. And a dog, the shape of a corgi, but with grey blue spots on a what background. And pale, grey-blue eyes.</w:t>
-      </w:r>
-    </w:p>
-    <w:p>
-      <w:r>
-        <w:t xml:space="preserve">A large man, who somehow managed to look clumsy, even when all he was doing was walking in the shop. He paid with a card which he got out of his wallet, several other cards dropped to the floor, he bent to pick them up. Doing that he caught a basked of crisps that was in front of the checkout. The small Indian woman behind the counter – whose name was </w:t>
+        <w:t xml:space="preserve"> freshener! Klee tried to stop his mind from boggling. If your nose was blocked from hay fever, why did you need the air freshener? Or was the story that you needed the hay fever tablets because otherwise you couldn’t breathe, but when you could breathe – whatever environment it was that you were in, you were going to need air freshener.</w:t>
+      </w:r>
+    </w:p>
+    <w:p>
+      <w:r>
+        <w:t>A woman, thirties, short hair, no wedding ring. Two dogs. A poodle, or something like that, one of these adorable crosses. And a dog, the shape of a corgi, but with grey-blue spots against a white background. And pale, grey-blue eyes.</w:t>
+      </w:r>
+    </w:p>
+    <w:p>
+      <w:r>
+        <w:t xml:space="preserve">A large man, who somehow managed to look clumsy, even when all he was doing was walking in the shop. He paid with a card which he got out of his wallet, several other cards dropped to the floor, he bent to pick them up. Doing that he caught a basket of crisps that was in front of the checkout. The small Indian woman behind the counter – whose name was </w:t>
       </w:r>
       <w:proofErr w:type="spellStart"/>
       <w:r>
@@ -79,7 +79,7 @@
       </w:r>
       <w:proofErr w:type="spellEnd"/>
       <w:r>
-        <w:t>, came out from behind the counter to help him pick up the crips. The small Indian man fixed him with a glance. Making sure that he paid. This guys name was Sunny. It had crossed both Sunny, and Klee’s mind that this clumsiness was just and act to create a distraction so that the clumsy man could steal chocolate, or crisps.</w:t>
+        <w:t xml:space="preserve"> – came out from behind the counter to help him pick up the crisps. The small Indian man fixed him with a glance. Making sure that he paid. This guy’s name was Sunny. It had crossed both Sunny, and Klee’s mind that this clumsiness was just an act to create a distraction so that the clumsy man could steal chocolate, or crisps.</w:t>
       </w:r>
     </w:p>
     <w:p>
@@ -113,7 +113,7 @@
     </w:p>
     <w:p>
       <w:r>
-        <w:t>When, off the top of his head he listed exactly the things that had been stolen, the other policemen were immediately suspicious? Was this an insurance job? No, it wasn’t, no insurance.</w:t>
+        <w:t>When, off the top of his head he listed exactly the things that had been stolen, the other policemen were immediately suspicious. Was this an insurance job? No, it wasn’t, no insurance.</w:t>
       </w:r>
     </w:p>
     <w:p>
@@ -121,12 +121,12 @@
         <w:t>But what he did have was a good memory.</w:t>
       </w:r>
       <w:r>
-        <w:t xml:space="preserve"> A Chinese puzzle box, a set of steel rings, a book of1000 card tricks that can be done without preparation. A guillotine (1:76 scale).</w:t>
-      </w:r>
-    </w:p>
-    <w:p>
-      <w:r>
-        <w:t xml:space="preserve">Klee had started with one book “Remember Everything!” But before long, he had his own bookshelf full of books on memory tricks. </w:t>
+        <w:t xml:space="preserve"> A Chinese puzzle box, a set of steel rings, a book of 1,000 card tricks that can be done without preparation. A guillotine (1:76 scale).</w:t>
+      </w:r>
+    </w:p>
+    <w:p>
+      <w:r>
+        <w:t xml:space="preserve">Klee had started with one book, “Remember Everything!” But before long, he had his own bookshelf full of books on memory tricks. </w:t>
       </w:r>
     </w:p>
     <w:p>
@@ -139,7 +139,7 @@
     </w:p>
     <w:p>
       <w:r>
-        <w:t>What he would find himself doing, especially in crime scenes, is talking to himself, telling himself what he could see, and then going over and over this list of things that could see in his head.</w:t>
+        <w:t>What he would find himself doing, especially in crime scenes, is talking to himself, telling himself what he could see, and then going over and over this list of things that he could see in his head.</w:t>
       </w:r>
     </w:p>
     <w:p>
@@ -153,7 +153,7 @@
     </w:p>
     <w:p>
       <w:r>
-        <w:t>Was it like a rap or hip-hop word spitting.</w:t>
+        <w:t>Was it like a rap or hip-hop word spitting?</w:t>
       </w:r>
     </w:p>
     <w:p>
@@ -222,7 +222,7 @@
     </w:p>
     <w:p>
       <w:r>
-        <w:t>A teas made! A cuddly toy! A fondue set. What the holy living fuck was a fondue set</w:t>
+        <w:t>A Teasmade! A cuddly toy! A fondue set. What the holy living fuck was a fondue set</w:t>
       </w:r>
       <w:r>
         <w:t xml:space="preserve">? This was the seventies. A machine that woke you up to the </w:t>

</xml_diff>